<commit_message>
Add ERP.2026.14 change request in project Word style
Customer request for auto-shift of prohibition dates and period opening via DO 3. Markdown source is zayavka.md; Word copies use the ERP.2026.14 filename pattern.

Co-authored-by: an_skripko <an_skripko@vk.com>
</commit_message>
<xml_diff>
--- a/openspec/changes/np-dates-of-prohibition-setup/tz.docx
+++ b/openspec/changes/np-dates-of-prohibition-setup/tz.docx
@@ -138,6 +138,33 @@
           <w:sz w:val="28"/>
         </w:rPr>
         <w:t>)</w:t>
+      </w:r>
+    </w:p>
+    <w:p>
+      <w:pPr>
+        <w:spacing w:after="120" w:before="0" w:line="360" w:lineRule="auto"/>
+        <w:ind w:firstLine="709"/>
+        <w:jc w:val="both"/>
+      </w:pPr>
+      <w:r>
+        <w:rPr>
+          <w:rFonts w:ascii="Times New Roman" w:hAnsi="Times New Roman" w:eastAsia="Times New Roman" w:cs="Times New Roman"/>
+          <w:b/>
+          <w:i w:val="0"/>
+          <w:color w:val="000000"/>
+          <w:sz w:val="28"/>
+        </w:rPr>
+        <w:t>Номер заявки:</w:t>
+      </w:r>
+      <w:r>
+        <w:rPr>
+          <w:rFonts w:ascii="Times New Roman" w:hAnsi="Times New Roman" w:eastAsia="Times New Roman" w:cs="Times New Roman"/>
+          <w:b w:val="0"/>
+          <w:i w:val="0"/>
+          <w:color w:val="000000"/>
+          <w:sz w:val="28"/>
+        </w:rPr>
+        <w:t xml:space="preserve"> ERP.2026.14</w:t>
       </w:r>
     </w:p>
     <w:p>

</xml_diff>